<commit_message>
Remove third-party provider name from CV copies
</commit_message>
<xml_diff>
--- a/third-portfolio/assets/Martin_Sidorov_2025_CV.docx
+++ b/third-portfolio/assets/Martin_Sidorov_2025_CV.docx
@@ -955,24 +955,24 @@
           <w:position w:val="0"/>
           <w:shd w:val="clear" w:color="auto" w:fill="auto"/>
         </w:rPr>
-        <w:t xml:space="preserve">, leveraging Golang and REST API integration with </w:t>
-      </w:r>
-      <w:r>
-        <w:rPr>
-          <w:rFonts w:ascii="Merriweather" w:cs="Merriweather" w:eastAsia="Merriweather" w:hAnsi="Merriweather"/>
-          <w:b w:val="1"/>
-          <w:bCs w:val="1"/>
-          <w:i w:val="0"/>
-          <w:iCs w:val="0"/>
-          <w:strike w:val="0"/>
-          <w:color w:val="#2e3d50"/>
-          <w:u w:val="none"/>
-          <w:sz w:val="14.45"/>
-          <w:szCs w:val="14.45"/>
-          <w:position w:val="0"/>
-          <w:shd w:val="clear" w:color="auto" w:fill="auto"/>
-        </w:rPr>
-        <w:t xml:space="preserve">Banking Circle</w:t>
+        <w:t xml:space="preserve">, leveraging Golang and REST API integration with a </w:t>
+      </w:r>
+      <w:r>
+        <w:rPr>
+          <w:rFonts w:ascii="Merriweather" w:cs="Merriweather" w:eastAsia="Merriweather" w:hAnsi="Merriweather"/>
+          <w:b w:val="1"/>
+          <w:bCs w:val="1"/>
+          <w:i w:val="0"/>
+          <w:iCs w:val="0"/>
+          <w:strike w:val="0"/>
+          <w:color w:val="#2e3d50"/>
+          <w:u w:val="none"/>
+          <w:sz w:val="14.45"/>
+          <w:szCs w:val="14.45"/>
+          <w:position w:val="0"/>
+          <w:shd w:val="clear" w:color="auto" w:fill="auto"/>
+        </w:rPr>
+        <w:t xml:space="preserve">third-party provider</w:t>
       </w:r>
       <w:r>
         <w:rPr>

</xml_diff>